<commit_message>
docs: align movement dossier with team attribution
</commit_message>
<xml_diff>
--- a/docs/DOSSIER_MOVIMIENTO_ARMONICO.docx
+++ b/docs/DOSSIER_MOVIMIENTO_ARMONICO.docx
@@ -15,7 +15,7 @@
         <w:pStyle w:val="Subtitle"/>
       </w:pPr>
       <w:r>
-        <w:t>Programa de investigación con Nico y ruta hacia Harmonic Beacon</w:t>
+        <w:t>Investigación del equipo de Harmonic Beacon sobre movimiento y sonido</w:t>
       </w:r>
     </w:p>
     <w:p>
@@ -34,7 +34,7 @@
         <w:t>Estado:</w:t>
       </w:r>
       <w:r>
-        <w:t xml:space="preserve"> propuesta metodológica y banco sintético reproducible. No hay aún resultados experimentales de Nico.</w:t>
+        <w:t xml:space="preserve"> propuesta metodológica y banco sintético reproducible. No hay aún resultados experimentales del caso principal.</w:t>
       </w:r>
     </w:p>
     <w:p>
@@ -56,18 +56,18 @@
         <w:t>una tarea comparable</w:t>
       </w:r>
       <w:r>
-        <w:t>. La intuición de Saira es más fuerte: en ciertos momentos puede haber una reorganización corporal y subjetiva extraordinaria. Esa intuición orienta preguntas; no se usará como etiqueta anticipada de los videos ni como resultado ya demostrado.</w:t>
+        <w:t>. Una hipótesis del programa plantea que en ciertos momentos puede haber una reorganización corporal y subjetiva extraordinaria. Esta hipótesis orienta preguntas; no se usará como etiqueta anticipada de los videos ni como resultado ya demostrado.</w:t>
       </w:r>
     </w:p>
     <w:p>
       <w:r>
-        <w:t xml:space="preserve">Nico será el primer caso intensivo. El alcance inicial es </w:t>
+        <w:t xml:space="preserve">El primer estudio será un caso intensivo de rope flow. El alcance inicial es </w:t>
       </w:r>
       <w:r>
         <w:rPr>
           <w:b/>
         </w:rPr>
-        <w:t>otro día de Nico realizando figuras comparables</w:t>
+        <w:t>otra sesión de la misma persona realizando figuras comparables</w:t>
       </w:r>
       <w:r>
         <w:t>, no todas las personas ni todas las danzas. Primero averiguaremos qué se puede observar de verdad con las cámaras disponibles; después probaremos asociaciones en sesiones nuevas; finalmente estudiaremos si escuchar el movimiento mediante Beacon cambia la ejecución o la experiencia.</w:t>
@@ -329,7 +329,7 @@
                 <w:b/>
                 <w:sz w:val="14"/>
               </w:rPr>
-              <w:t>Harmonic Information Theory (HIT), Mariano Fernández Méndez y Nicolás Echániz</w:t>
+              <w:t>Harmonic Information Theory (HIT)</w:t>
             </w:r>
           </w:p>
         </w:tc>
@@ -467,7 +467,7 @@
               <w:rPr>
                 <w:sz w:val="14"/>
               </w:rPr>
-              <w:t>Preguntas neutrales a Nico inmediatamente después de cada bloque sobre facilidad, placer, atención, esfuerzo y continuidad vivida.</w:t>
+              <w:t>Preguntas neutrales a la persona participante inmediatamente después de cada bloque sobre facilidad, placer, atención, esfuerzo y continuidad vivida.</w:t>
             </w:r>
           </w:p>
         </w:tc>
@@ -584,7 +584,7 @@
               <w:rPr>
                 <w:sz w:val="14"/>
               </w:rPr>
-              <w:t>Sus resultados en morfogénesis no prueban bioelectricidad celular específica ni conciencia elevada en Nico. ECG/EMG, si se agregan, miden otras señales.</w:t>
+              <w:t>Sus resultados en morfogénesis no prueban bioelectricidad celular específica ni conciencia elevada durante rope flow. ECG/EMG, si se agregan, miden otras señales.</w:t>
             </w:r>
           </w:p>
         </w:tc>
@@ -609,7 +609,7 @@
                 <w:b/>
                 <w:sz w:val="14"/>
               </w:rPr>
-              <w:t>Nico: rope flow, HIT y Harmonic Weaver</w:t>
+              <w:t>Práctica de rope flow y Harmonic Weaver</w:t>
             </w:r>
           </w:p>
         </w:tc>
@@ -653,7 +653,7 @@
               <w:rPr>
                 <w:sz w:val="14"/>
               </w:rPr>
-              <w:t>Elegir figuras que Nico realmente practica, formular predicciones HIT y preparar sonificación trazable de señales validadas.</w:t>
+              <w:t>Elegir figuras que la persona participante realmente practica, formular predicciones HIT y preparar sonificación trazable de señales validadas.</w:t>
             </w:r>
           </w:p>
         </w:tc>
@@ -735,7 +735,7 @@
         <w:t>4. Experiencia y estética.</w:t>
       </w:r>
       <w:r>
-        <w:t xml:space="preserve"> Nico informará por bloque qué sintió sin escuchar una respuesta sugerida. Evaluadores independientes verán clips completos, elegidos sin seleccionar sólo los más bellos, y puntuarán belleza, sensualidad, fluidez y esfuerzo aparente. La vivencia de Nico y el juicio de terceros son dos resultados distintos.</w:t>
+        <w:t xml:space="preserve"> La persona participante informará por bloque qué sintió sin escuchar una respuesta sugerida. Evaluadores independientes verán clips completos, elegidos sin seleccionar sólo los más bellos, y puntuarán belleza, sensualidad, fluidez y esfuerzo aparente. La vivencia de la persona participante y el juicio de terceros son dos resultados distintos.</w:t>
       </w:r>
     </w:p>
     <w:p>
@@ -1475,7 +1475,7 @@
         <w:pStyle w:val="Heading1"/>
       </w:pPr>
       <w:r>
-        <w:t>De un video de baile al sonido, y después a Nico</w:t>
+        <w:t>De un video de baile al sonido, y después al caso principal</w:t>
       </w:r>
     </w:p>
     <w:p>
@@ -1513,7 +1513,7 @@
         <w:t>cadena técnica</w:t>
       </w:r>
       <w:r>
-        <w:t>, no la hipótesis de Nico. Sólo después se usará un video original consentido de Nico y, más adelante, feedback en vivo durante su movimiento.</w:t>
+        <w:t>, no la hipótesis del estudio. Sólo después se usará un video original consentido de rope flow y, más adelante, feedback en vivo durante el movimiento.</w:t>
       </w:r>
     </w:p>
     <w:p>
@@ -1553,7 +1553,7 @@
         <w:t>Equipo humano:</w:t>
       </w:r>
       <w:r>
-        <w:t xml:space="preserve"> Saira define alcance, permisos y criterio de uso de imagen; Nico elige figuras habituales y decide si participa y cómo se usan sus videos; una persona con formación en Laban revisa la traducción de categorías; dos o más anotadores independientes ayudan a evaluar acuerdo; alguien de biomecánica/captura y, para costo oxidativo, fisiología del ejercicio o laboratorio con calorimetría. La lista con entregables concretos está en </w:t>
+        <w:t xml:space="preserve"> la coordinación define alcance, permisos y criterio de uso de imagen; la persona participante elige figuras habituales y decide si participa y cómo se usan sus videos; una persona con formación en Laban revisa la traducción de categorías; dos o más anotadores independientes ayudan a evaluar acuerdo; alguien de biomecánica/captura y, para costo oxidativo, fisiología del ejercicio o laboratorio con calorimetría. La lista con entregables concretos está en </w:t>
       </w:r>
       <w:r>
         <w:rPr>
@@ -1599,7 +1599,7 @@
         <w:t>Desarrollo con videos consentidos:</w:t>
       </w:r>
       <w:r>
-        <w:t xml:space="preserve"> inventariar originales, escoger una o dos figuras de Nico y congelar guía de anotación y análisis.</w:t>
+        <w:t xml:space="preserve"> inventariar originales, escoger una o dos figuras habituales y congelar guía de anotación y análisis.</w:t>
       </w:r>
     </w:p>
     <w:p>
@@ -1641,7 +1641,7 @@
         <w:t>Demo de sonificación:</w:t>
       </w:r>
       <w:r>
-        <w:t xml:space="preserve"> primero archivo sintético y video de baile autorizado, después video de Nico, finalmente intervención live con protocolo independiente.</w:t>
+        <w:t xml:space="preserve"> primero archivo sintético y video de baile autorizado, después video del caso principal, finalmente intervención live con protocolo independiente.</w:t>
       </w:r>
     </w:p>
     <w:p>
@@ -1715,7 +1715,7 @@
         <w:t>Advertencia metodológica central:</w:t>
       </w:r>
       <w:r>
-        <w:t xml:space="preserve"> un dato sintético demuestra que una implementación distingue construcciones conocidas; no confirma que la naturaleza, Nico o una audiencia produzcan las relaciones hipotetizadas.</w:t>
+        <w:t xml:space="preserve"> un dato sintético demuestra que una implementación distingue construcciones conocidas; no confirma que la naturaleza, una persona participante o una audiencia produzcan las relaciones hipotetizadas.</w:t>
       </w:r>
     </w:p>
     <w:sectPr>

</xml_diff>